<commit_message>
Python now messaging C# through RabbitMQ
</commit_message>
<xml_diff>
--- a/PBT205_A3_Group2_README.docx
+++ b/PBT205_A3_Group2_README.docx
@@ -2,15 +2,684 @@
 <file path=word/document.xml><?xml version="1.0" encoding="utf-8"?>
 <w:document xmlns:wpc="http://schemas.microsoft.com/office/word/2010/wordprocessingCanvas" xmlns:cx="http://schemas.microsoft.com/office/drawing/2014/chartex" xmlns:cx1="http://schemas.microsoft.com/office/drawing/2015/9/8/chartex" xmlns:cx2="http://schemas.microsoft.com/office/drawing/2015/10/21/chartex" xmlns:cx3="http://schemas.microsoft.com/office/drawing/2016/5/9/chartex" xmlns:cx4="http://schemas.microsoft.com/office/drawing/2016/5/10/chartex" xmlns:cx5="http://schemas.microsoft.com/office/drawing/2016/5/11/chartex" xmlns:cx6="http://schemas.microsoft.com/office/drawing/2016/5/12/chartex" xmlns:cx7="http://schemas.microsoft.com/office/drawing/2016/5/13/chartex" xmlns:cx8="http://schemas.microsoft.com/office/drawing/2016/5/14/chartex" xmlns:mc="http://schemas.openxmlformats.org/markup-compatibility/2006" xmlns:aink="http://schemas.microsoft.com/office/drawing/2016/ink" xmlns:am3d="http://schemas.microsoft.com/office/drawing/2017/model3d" xmlns:o="urn:schemas-microsoft-com:office:office" xmlns:oel="http://schemas.microsoft.com/office/2019/extlst" xmlns:r="http://schemas.openxmlformats.org/officeDocument/2006/relationships" xmlns:m="http://schemas.openxmlformats.org/officeDocument/2006/math" xmlns:v="urn:schemas-microsoft-com:vml" xmlns:wp14="http://schemas.microsoft.com/office/word/2010/wordprocessingDrawing" xmlns:wp="http://schemas.openxmlformats.org/drawingml/2006/wordprocessingDrawing" xmlns:w10="urn:schemas-microsoft-com:office:word" xmlns:w="http://schemas.openxmlformats.org/wordprocessingml/2006/main" xmlns:w14="http://schemas.microsoft.com/office/word/2010/wordml" xmlns:w15="http://schemas.microsoft.com/office/word/2012/wordml" xmlns:w16cex="http://schemas.microsoft.com/office/word/2018/wordml/cex" xmlns:w16cid="http://schemas.microsoft.com/office/word/2016/wordml/cid" xmlns:w16="http://schemas.microsoft.com/office/word/2018/wordml" xmlns:w16du="http://schemas.microsoft.com/office/word/2023/wordml/word16du" xmlns:w16sdtdh="http://schemas.microsoft.com/office/word/2020/wordml/sdtdatahash" xmlns:w16sdtfl="http://schemas.microsoft.com/office/word/2024/wordml/sdtformatlock" xmlns:w16se="http://schemas.microsoft.com/office/word/2015/wordml/symex" xmlns:wpg="http://schemas.microsoft.com/office/word/2010/wordprocessingGroup" xmlns:wpi="http://schemas.microsoft.com/office/word/2010/wordprocessingInk" xmlns:wne="http://schemas.microsoft.com/office/word/2006/wordml" xmlns:wps="http://schemas.microsoft.com/office/word/2010/wordprocessingShape" mc:Ignorable="w14 w15 w16se w16cid w16 w16cex w16sdtdh w16sdtfl w16du wp14">
   <w:body>
-    <w:p/>
+    <w:p>
+      <w:pPr>
+        <w:spacing w:after="0"/>
+        <w:jc w:val="center"/>
+        <w:rPr>
+          <w:b/>
+          <w:bCs/>
+        </w:rPr>
+      </w:pPr>
+      <w:r>
+        <w:rPr>
+          <w:b/>
+          <w:bCs/>
+        </w:rPr>
+        <w:t>TESTING AND RUNNING EXCHANGE PROGRAM</w:t>
+      </w:r>
+    </w:p>
+    <w:p>
+      <w:pPr>
+        <w:spacing w:after="0"/>
+      </w:pPr>
+      <w:r>
+        <w:t>Date: 6</w:t>
+      </w:r>
+      <w:r>
+        <w:rPr>
+          <w:vertAlign w:val="superscript"/>
+        </w:rPr>
+        <w:t>th</w:t>
+      </w:r>
+      <w:r>
+        <w:t xml:space="preserve"> April 2026</w:t>
+      </w:r>
+    </w:p>
+    <w:p>
+      <w:pPr>
+        <w:spacing w:after="0"/>
+      </w:pPr>
+    </w:p>
+    <w:p>
+      <w:pPr>
+        <w:pStyle w:val="ListParagraph"/>
+        <w:numPr>
+          <w:ilvl w:val="0"/>
+          <w:numId w:val="1"/>
+        </w:numPr>
+        <w:spacing w:after="0"/>
+      </w:pPr>
+      <w:r>
+        <w:t>Make sure Docker Desktop is running and any previous containers relating to A3 are deleted, otherwise looking something like this:</w:t>
+      </w:r>
+    </w:p>
+    <w:p>
+      <w:pPr>
+        <w:spacing w:after="0"/>
+      </w:pPr>
+      <w:r>
+        <w:drawing>
+          <wp:inline distT="0" distB="0" distL="0" distR="0" wp14:anchorId="0B99AB90" wp14:editId="4CFC4A46">
+            <wp:extent cx="6858000" cy="3866515"/>
+            <wp:effectExtent l="0" t="0" r="0" b="635"/>
+            <wp:docPr id="1283128960" name="Picture 1"/>
+            <wp:cNvGraphicFramePr>
+              <a:graphicFrameLocks xmlns:a="http://schemas.openxmlformats.org/drawingml/2006/main" noChangeAspect="1"/>
+            </wp:cNvGraphicFramePr>
+            <a:graphic xmlns:a="http://schemas.openxmlformats.org/drawingml/2006/main">
+              <a:graphicData uri="http://schemas.openxmlformats.org/drawingml/2006/picture">
+                <pic:pic xmlns:pic="http://schemas.openxmlformats.org/drawingml/2006/picture">
+                  <pic:nvPicPr>
+                    <pic:cNvPr id="1283128960" name=""/>
+                    <pic:cNvPicPr/>
+                  </pic:nvPicPr>
+                  <pic:blipFill>
+                    <a:blip r:embed="rId6"/>
+                    <a:stretch>
+                      <a:fillRect/>
+                    </a:stretch>
+                  </pic:blipFill>
+                  <pic:spPr>
+                    <a:xfrm>
+                      <a:off x="0" y="0"/>
+                      <a:ext cx="6858000" cy="3866515"/>
+                    </a:xfrm>
+                    <a:prstGeom prst="rect">
+                      <a:avLst/>
+                    </a:prstGeom>
+                  </pic:spPr>
+                </pic:pic>
+              </a:graphicData>
+            </a:graphic>
+          </wp:inline>
+        </w:drawing>
+      </w:r>
+    </w:p>
+    <w:p>
+      <w:pPr>
+        <w:spacing w:after="0"/>
+      </w:pPr>
+    </w:p>
+    <w:p>
+      <w:pPr>
+        <w:spacing w:after="0"/>
+      </w:pPr>
+    </w:p>
+    <w:p>
+      <w:pPr>
+        <w:pStyle w:val="ListParagraph"/>
+        <w:numPr>
+          <w:ilvl w:val="0"/>
+          <w:numId w:val="1"/>
+        </w:numPr>
+        <w:spacing w:after="0"/>
+      </w:pPr>
+      <w:r>
+        <w:t>Open Power</w:t>
+      </w:r>
+      <w:r>
+        <w:t>S</w:t>
+      </w:r>
+      <w:r>
+        <w:t>hell from within “ALL_SERVICES”</w:t>
+      </w:r>
+    </w:p>
+    <w:p>
+      <w:pPr>
+        <w:spacing w:after="0"/>
+      </w:pPr>
+      <w:r>
+        <w:drawing>
+          <wp:inline distT="0" distB="0" distL="0" distR="0" wp14:anchorId="484EEA58" wp14:editId="045C33FF">
+            <wp:extent cx="6858000" cy="2482850"/>
+            <wp:effectExtent l="0" t="0" r="0" b="0"/>
+            <wp:docPr id="1808077389" name="Picture 1"/>
+            <wp:cNvGraphicFramePr>
+              <a:graphicFrameLocks xmlns:a="http://schemas.openxmlformats.org/drawingml/2006/main" noChangeAspect="1"/>
+            </wp:cNvGraphicFramePr>
+            <a:graphic xmlns:a="http://schemas.openxmlformats.org/drawingml/2006/main">
+              <a:graphicData uri="http://schemas.openxmlformats.org/drawingml/2006/picture">
+                <pic:pic xmlns:pic="http://schemas.openxmlformats.org/drawingml/2006/picture">
+                  <pic:nvPicPr>
+                    <pic:cNvPr id="1808077389" name=""/>
+                    <pic:cNvPicPr/>
+                  </pic:nvPicPr>
+                  <pic:blipFill>
+                    <a:blip r:embed="rId7"/>
+                    <a:stretch>
+                      <a:fillRect/>
+                    </a:stretch>
+                  </pic:blipFill>
+                  <pic:spPr>
+                    <a:xfrm>
+                      <a:off x="0" y="0"/>
+                      <a:ext cx="6858000" cy="2482850"/>
+                    </a:xfrm>
+                    <a:prstGeom prst="rect">
+                      <a:avLst/>
+                    </a:prstGeom>
+                  </pic:spPr>
+                </pic:pic>
+              </a:graphicData>
+            </a:graphic>
+          </wp:inline>
+        </w:drawing>
+      </w:r>
+    </w:p>
+    <w:p>
+      <w:pPr>
+        <w:spacing w:after="0"/>
+      </w:pPr>
+    </w:p>
+    <w:p>
+      <w:pPr>
+        <w:spacing w:after="0"/>
+      </w:pPr>
+    </w:p>
+    <w:p>
+      <w:pPr>
+        <w:spacing w:after="0"/>
+      </w:pPr>
+    </w:p>
+    <w:p>
+      <w:pPr>
+        <w:spacing w:after="0"/>
+      </w:pPr>
+    </w:p>
+    <w:p>
+      <w:pPr>
+        <w:pStyle w:val="ListParagraph"/>
+        <w:numPr>
+          <w:ilvl w:val="0"/>
+          <w:numId w:val="1"/>
+        </w:numPr>
+        <w:spacing w:after="0"/>
+      </w:pPr>
+      <w:r>
+        <w:lastRenderedPageBreak/>
+        <w:t xml:space="preserve">Build docker using </w:t>
+      </w:r>
+      <w:r>
+        <w:sym w:font="Wingdings" w:char="F0E0"/>
+      </w:r>
+      <w:r>
+        <w:t xml:space="preserve"> docker-compose up</w:t>
+      </w:r>
+      <w:r>
+        <w:t xml:space="preserve"> –build (because we need to build fresh builds)</w:t>
+      </w:r>
+    </w:p>
+    <w:p>
+      <w:pPr>
+        <w:spacing w:after="0"/>
+      </w:pPr>
+      <w:r>
+        <w:drawing>
+          <wp:inline distT="0" distB="0" distL="0" distR="0" wp14:anchorId="6B1879FA" wp14:editId="611327F1">
+            <wp:extent cx="6858000" cy="1524000"/>
+            <wp:effectExtent l="0" t="0" r="0" b="0"/>
+            <wp:docPr id="1205755909" name="Picture 1"/>
+            <wp:cNvGraphicFramePr>
+              <a:graphicFrameLocks xmlns:a="http://schemas.openxmlformats.org/drawingml/2006/main" noChangeAspect="1"/>
+            </wp:cNvGraphicFramePr>
+            <a:graphic xmlns:a="http://schemas.openxmlformats.org/drawingml/2006/main">
+              <a:graphicData uri="http://schemas.openxmlformats.org/drawingml/2006/picture">
+                <pic:pic xmlns:pic="http://schemas.openxmlformats.org/drawingml/2006/picture">
+                  <pic:nvPicPr>
+                    <pic:cNvPr id="1205755909" name=""/>
+                    <pic:cNvPicPr/>
+                  </pic:nvPicPr>
+                  <pic:blipFill>
+                    <a:blip r:embed="rId8"/>
+                    <a:stretch>
+                      <a:fillRect/>
+                    </a:stretch>
+                  </pic:blipFill>
+                  <pic:spPr>
+                    <a:xfrm>
+                      <a:off x="0" y="0"/>
+                      <a:ext cx="6858000" cy="1524000"/>
+                    </a:xfrm>
+                    <a:prstGeom prst="rect">
+                      <a:avLst/>
+                    </a:prstGeom>
+                  </pic:spPr>
+                </pic:pic>
+              </a:graphicData>
+            </a:graphic>
+          </wp:inline>
+        </w:drawing>
+      </w:r>
+    </w:p>
+    <w:p>
+      <w:pPr>
+        <w:spacing w:after="0"/>
+      </w:pPr>
+    </w:p>
+    <w:p>
+      <w:pPr>
+        <w:pStyle w:val="ListParagraph"/>
+        <w:numPr>
+          <w:ilvl w:val="0"/>
+          <w:numId w:val="1"/>
+        </w:numPr>
+        <w:spacing w:after="0"/>
+      </w:pPr>
+      <w:r>
+        <w:t>After a while exchange will be running and will look something like this:</w:t>
+      </w:r>
+    </w:p>
+    <w:p>
+      <w:pPr>
+        <w:spacing w:after="0"/>
+      </w:pPr>
+      <w:r>
+        <w:drawing>
+          <wp:inline distT="0" distB="0" distL="0" distR="0" wp14:anchorId="0CA782AC" wp14:editId="44E28F02">
+            <wp:extent cx="6858000" cy="3869690"/>
+            <wp:effectExtent l="0" t="0" r="0" b="0"/>
+            <wp:docPr id="1204700208" name="Picture 1"/>
+            <wp:cNvGraphicFramePr>
+              <a:graphicFrameLocks xmlns:a="http://schemas.openxmlformats.org/drawingml/2006/main" noChangeAspect="1"/>
+            </wp:cNvGraphicFramePr>
+            <a:graphic xmlns:a="http://schemas.openxmlformats.org/drawingml/2006/main">
+              <a:graphicData uri="http://schemas.openxmlformats.org/drawingml/2006/picture">
+                <pic:pic xmlns:pic="http://schemas.openxmlformats.org/drawingml/2006/picture">
+                  <pic:nvPicPr>
+                    <pic:cNvPr id="1204700208" name=""/>
+                    <pic:cNvPicPr/>
+                  </pic:nvPicPr>
+                  <pic:blipFill>
+                    <a:blip r:embed="rId9"/>
+                    <a:stretch>
+                      <a:fillRect/>
+                    </a:stretch>
+                  </pic:blipFill>
+                  <pic:spPr>
+                    <a:xfrm>
+                      <a:off x="0" y="0"/>
+                      <a:ext cx="6858000" cy="3869690"/>
+                    </a:xfrm>
+                    <a:prstGeom prst="rect">
+                      <a:avLst/>
+                    </a:prstGeom>
+                  </pic:spPr>
+                </pic:pic>
+              </a:graphicData>
+            </a:graphic>
+          </wp:inline>
+        </w:drawing>
+      </w:r>
+    </w:p>
+    <w:p>
+      <w:pPr>
+        <w:spacing w:after="0"/>
+      </w:pPr>
+    </w:p>
+    <w:p>
+      <w:pPr>
+        <w:pStyle w:val="ListParagraph"/>
+        <w:numPr>
+          <w:ilvl w:val="0"/>
+          <w:numId w:val="1"/>
+        </w:numPr>
+        <w:spacing w:after="0"/>
+      </w:pPr>
+      <w:r>
+        <w:t xml:space="preserve">Go to RabbitMQ, login using “guest” as username and password: </w:t>
+      </w:r>
+      <w:hyperlink r:id="rId10" w:history="1">
+        <w:r>
+          <w:rPr>
+            <w:rStyle w:val="Hyperlink"/>
+          </w:rPr>
+          <w:t>http://localhost:15672/#/queues</w:t>
+        </w:r>
+      </w:hyperlink>
+    </w:p>
+    <w:p>
+      <w:pPr>
+        <w:spacing w:after="0"/>
+      </w:pPr>
+      <w:r>
+        <w:drawing>
+          <wp:inline distT="0" distB="0" distL="0" distR="0" wp14:anchorId="5DF207E1" wp14:editId="4DB33141">
+            <wp:extent cx="6858000" cy="1943735"/>
+            <wp:effectExtent l="0" t="0" r="0" b="0"/>
+            <wp:docPr id="727262853" name="Picture 1"/>
+            <wp:cNvGraphicFramePr>
+              <a:graphicFrameLocks xmlns:a="http://schemas.openxmlformats.org/drawingml/2006/main" noChangeAspect="1"/>
+            </wp:cNvGraphicFramePr>
+            <a:graphic xmlns:a="http://schemas.openxmlformats.org/drawingml/2006/main">
+              <a:graphicData uri="http://schemas.openxmlformats.org/drawingml/2006/picture">
+                <pic:pic xmlns:pic="http://schemas.openxmlformats.org/drawingml/2006/picture">
+                  <pic:nvPicPr>
+                    <pic:cNvPr id="727262853" name=""/>
+                    <pic:cNvPicPr/>
+                  </pic:nvPicPr>
+                  <pic:blipFill>
+                    <a:blip r:embed="rId11"/>
+                    <a:stretch>
+                      <a:fillRect/>
+                    </a:stretch>
+                  </pic:blipFill>
+                  <pic:spPr>
+                    <a:xfrm>
+                      <a:off x="0" y="0"/>
+                      <a:ext cx="6858000" cy="1943735"/>
+                    </a:xfrm>
+                    <a:prstGeom prst="rect">
+                      <a:avLst/>
+                    </a:prstGeom>
+                  </pic:spPr>
+                </pic:pic>
+              </a:graphicData>
+            </a:graphic>
+          </wp:inline>
+        </w:drawing>
+      </w:r>
+    </w:p>
+    <w:p>
+      <w:pPr>
+        <w:spacing w:after="0"/>
+      </w:pPr>
+      <w:r>
+        <w:t>We should be able to see queues “Orders” and “Trades” which are created during the docker build (these are setup from C# exchange)</w:t>
+      </w:r>
+    </w:p>
+    <w:p>
+      <w:pPr>
+        <w:spacing w:after="0"/>
+      </w:pPr>
+    </w:p>
+    <w:p>
+      <w:pPr>
+        <w:pStyle w:val="ListParagraph"/>
+        <w:numPr>
+          <w:ilvl w:val="0"/>
+          <w:numId w:val="1"/>
+        </w:numPr>
+        <w:spacing w:after="0"/>
+      </w:pPr>
+      <w:r>
+        <w:lastRenderedPageBreak/>
+        <w:t>Navigate to the “GUI” folder and run a second instance of PowerShell from here:</w:t>
+      </w:r>
+    </w:p>
+    <w:p>
+      <w:pPr>
+        <w:spacing w:after="0"/>
+      </w:pPr>
+      <w:r>
+        <w:drawing>
+          <wp:inline distT="0" distB="0" distL="0" distR="0" wp14:anchorId="49302310" wp14:editId="0C86CED3">
+            <wp:extent cx="6858000" cy="2311400"/>
+            <wp:effectExtent l="0" t="0" r="0" b="0"/>
+            <wp:docPr id="407516914" name="Picture 1"/>
+            <wp:cNvGraphicFramePr>
+              <a:graphicFrameLocks xmlns:a="http://schemas.openxmlformats.org/drawingml/2006/main" noChangeAspect="1"/>
+            </wp:cNvGraphicFramePr>
+            <a:graphic xmlns:a="http://schemas.openxmlformats.org/drawingml/2006/main">
+              <a:graphicData uri="http://schemas.openxmlformats.org/drawingml/2006/picture">
+                <pic:pic xmlns:pic="http://schemas.openxmlformats.org/drawingml/2006/picture">
+                  <pic:nvPicPr>
+                    <pic:cNvPr id="407516914" name=""/>
+                    <pic:cNvPicPr/>
+                  </pic:nvPicPr>
+                  <pic:blipFill>
+                    <a:blip r:embed="rId12"/>
+                    <a:stretch>
+                      <a:fillRect/>
+                    </a:stretch>
+                  </pic:blipFill>
+                  <pic:spPr>
+                    <a:xfrm>
+                      <a:off x="0" y="0"/>
+                      <a:ext cx="6858000" cy="2311400"/>
+                    </a:xfrm>
+                    <a:prstGeom prst="rect">
+                      <a:avLst/>
+                    </a:prstGeom>
+                  </pic:spPr>
+                </pic:pic>
+              </a:graphicData>
+            </a:graphic>
+          </wp:inline>
+        </w:drawing>
+      </w:r>
+    </w:p>
+    <w:p>
+      <w:pPr>
+        <w:spacing w:after="0"/>
+      </w:pPr>
+    </w:p>
+    <w:p>
+      <w:pPr>
+        <w:pStyle w:val="ListParagraph"/>
+        <w:numPr>
+          <w:ilvl w:val="0"/>
+          <w:numId w:val="1"/>
+        </w:numPr>
+        <w:spacing w:after="0"/>
+      </w:pPr>
+      <w:r>
+        <w:t xml:space="preserve">Run python </w:t>
+      </w:r>
+      <w:r>
+        <w:sym w:font="Wingdings" w:char="F0E0"/>
+      </w:r>
+      <w:r>
+        <w:t xml:space="preserve"> python gui.py</w:t>
+      </w:r>
+    </w:p>
+    <w:p>
+      <w:pPr>
+        <w:spacing w:after="0"/>
+      </w:pPr>
+      <w:r>
+        <w:drawing>
+          <wp:inline distT="0" distB="0" distL="0" distR="0" wp14:anchorId="7823FAD7" wp14:editId="0405899C">
+            <wp:extent cx="6858000" cy="1456690"/>
+            <wp:effectExtent l="0" t="0" r="0" b="0"/>
+            <wp:docPr id="456487325" name="Picture 1"/>
+            <wp:cNvGraphicFramePr>
+              <a:graphicFrameLocks xmlns:a="http://schemas.openxmlformats.org/drawingml/2006/main" noChangeAspect="1"/>
+            </wp:cNvGraphicFramePr>
+            <a:graphic xmlns:a="http://schemas.openxmlformats.org/drawingml/2006/main">
+              <a:graphicData uri="http://schemas.openxmlformats.org/drawingml/2006/picture">
+                <pic:pic xmlns:pic="http://schemas.openxmlformats.org/drawingml/2006/picture">
+                  <pic:nvPicPr>
+                    <pic:cNvPr id="456487325" name=""/>
+                    <pic:cNvPicPr/>
+                  </pic:nvPicPr>
+                  <pic:blipFill>
+                    <a:blip r:embed="rId13"/>
+                    <a:stretch>
+                      <a:fillRect/>
+                    </a:stretch>
+                  </pic:blipFill>
+                  <pic:spPr>
+                    <a:xfrm>
+                      <a:off x="0" y="0"/>
+                      <a:ext cx="6858000" cy="1456690"/>
+                    </a:xfrm>
+                    <a:prstGeom prst="rect">
+                      <a:avLst/>
+                    </a:prstGeom>
+                  </pic:spPr>
+                </pic:pic>
+              </a:graphicData>
+            </a:graphic>
+          </wp:inline>
+        </w:drawing>
+      </w:r>
+    </w:p>
+    <w:p>
+      <w:pPr>
+        <w:spacing w:after="0"/>
+      </w:pPr>
+    </w:p>
+    <w:p>
+      <w:pPr>
+        <w:pStyle w:val="ListParagraph"/>
+        <w:numPr>
+          <w:ilvl w:val="0"/>
+          <w:numId w:val="1"/>
+        </w:numPr>
+        <w:spacing w:after="0"/>
+      </w:pPr>
+      <w:r>
+        <w:t>If all of the above worked you should get the GUI which currently looks like this:</w:t>
+      </w:r>
+    </w:p>
+    <w:p>
+      <w:pPr>
+        <w:spacing w:after="0"/>
+      </w:pPr>
+      <w:r>
+        <w:drawing>
+          <wp:inline distT="0" distB="0" distL="0" distR="0" wp14:anchorId="714C4D33" wp14:editId="0FE58C13">
+            <wp:extent cx="6858000" cy="3841750"/>
+            <wp:effectExtent l="0" t="0" r="0" b="6350"/>
+            <wp:docPr id="1256617009" name="Picture 1"/>
+            <wp:cNvGraphicFramePr>
+              <a:graphicFrameLocks xmlns:a="http://schemas.openxmlformats.org/drawingml/2006/main" noChangeAspect="1"/>
+            </wp:cNvGraphicFramePr>
+            <a:graphic xmlns:a="http://schemas.openxmlformats.org/drawingml/2006/main">
+              <a:graphicData uri="http://schemas.openxmlformats.org/drawingml/2006/picture">
+                <pic:pic xmlns:pic="http://schemas.openxmlformats.org/drawingml/2006/picture">
+                  <pic:nvPicPr>
+                    <pic:cNvPr id="1256617009" name=""/>
+                    <pic:cNvPicPr/>
+                  </pic:nvPicPr>
+                  <pic:blipFill>
+                    <a:blip r:embed="rId14"/>
+                    <a:stretch>
+                      <a:fillRect/>
+                    </a:stretch>
+                  </pic:blipFill>
+                  <pic:spPr>
+                    <a:xfrm>
+                      <a:off x="0" y="0"/>
+                      <a:ext cx="6858000" cy="3841750"/>
+                    </a:xfrm>
+                    <a:prstGeom prst="rect">
+                      <a:avLst/>
+                    </a:prstGeom>
+                  </pic:spPr>
+                </pic:pic>
+              </a:graphicData>
+            </a:graphic>
+          </wp:inline>
+        </w:drawing>
+      </w:r>
+    </w:p>
     <w:sectPr>
       <w:pgSz w:w="12240" w:h="15840"/>
-      <w:pgMar w:top="1440" w:right="1440" w:bottom="1440" w:left="1440" w:header="720" w:footer="720" w:gutter="0"/>
+      <w:pgMar w:top="720" w:right="720" w:bottom="720" w:left="720" w:header="720" w:footer="720" w:gutter="0"/>
       <w:cols w:space="720"/>
       <w:docGrid w:linePitch="360"/>
     </w:sectPr>
   </w:body>
 </w:document>
+</file>
+
+<file path=word/numbering.xml><?xml version="1.0" encoding="utf-8"?>
+<w:numbering xmlns:wpc="http://schemas.microsoft.com/office/word/2010/wordprocessingCanvas" xmlns:cx="http://schemas.microsoft.com/office/drawing/2014/chartex" xmlns:cx1="http://schemas.microsoft.com/office/drawing/2015/9/8/chartex" xmlns:cx2="http://schemas.microsoft.com/office/drawing/2015/10/21/chartex" xmlns:cx3="http://schemas.microsoft.com/office/drawing/2016/5/9/chartex" xmlns:cx4="http://schemas.microsoft.com/office/drawing/2016/5/10/chartex" xmlns:cx5="http://schemas.microsoft.com/office/drawing/2016/5/11/chartex" xmlns:cx6="http://schemas.microsoft.com/office/drawing/2016/5/12/chartex" xmlns:cx7="http://schemas.microsoft.com/office/drawing/2016/5/13/chartex" xmlns:cx8="http://schemas.microsoft.com/office/drawing/2016/5/14/chartex" xmlns:mc="http://schemas.openxmlformats.org/markup-compatibility/2006" xmlns:aink="http://schemas.microsoft.com/office/drawing/2016/ink" xmlns:am3d="http://schemas.microsoft.com/office/drawing/2017/model3d" xmlns:o="urn:schemas-microsoft-com:office:office" xmlns:oel="http://schemas.microsoft.com/office/2019/extlst" xmlns:r="http://schemas.openxmlformats.org/officeDocument/2006/relationships" xmlns:m="http://schemas.openxmlformats.org/officeDocument/2006/math" xmlns:v="urn:schemas-microsoft-com:vml" xmlns:wp14="http://schemas.microsoft.com/office/word/2010/wordprocessingDrawing" xmlns:wp="http://schemas.openxmlformats.org/drawingml/2006/wordprocessingDrawing" xmlns:w10="urn:schemas-microsoft-com:office:word" xmlns:w="http://schemas.openxmlformats.org/wordprocessingml/2006/main" xmlns:w14="http://schemas.microsoft.com/office/word/2010/wordml" xmlns:w15="http://schemas.microsoft.com/office/word/2012/wordml" xmlns:w16cex="http://schemas.microsoft.com/office/word/2018/wordml/cex" xmlns:w16cid="http://schemas.microsoft.com/office/word/2016/wordml/cid" xmlns:w16="http://schemas.microsoft.com/office/word/2018/wordml" xmlns:w16du="http://schemas.microsoft.com/office/word/2023/wordml/word16du" xmlns:w16sdtdh="http://schemas.microsoft.com/office/word/2020/wordml/sdtdatahash" xmlns:w16sdtfl="http://schemas.microsoft.com/office/word/2024/wordml/sdtformatlock" xmlns:w16se="http://schemas.microsoft.com/office/word/2015/wordml/symex" xmlns:wpg="http://schemas.microsoft.com/office/word/2010/wordprocessingGroup" xmlns:wpi="http://schemas.microsoft.com/office/word/2010/wordprocessingInk" xmlns:wne="http://schemas.microsoft.com/office/word/2006/wordml" xmlns:wps="http://schemas.microsoft.com/office/word/2010/wordprocessingShape" mc:Ignorable="w14 w15 w16se w16cid w16 w16cex w16sdtdh w16sdtfl w16du wp14">
+  <w:abstractNum w:abstractNumId="0" w15:restartNumberingAfterBreak="0">
+    <w:nsid w:val="0A6043EB"/>
+    <w:multiLevelType w:val="hybridMultilevel"/>
+    <w:tmpl w:val="A220512C"/>
+    <w:lvl w:ilvl="0" w:tplc="0409000F">
+      <w:start w:val="1"/>
+      <w:numFmt w:val="decimal"/>
+      <w:lvlText w:val="%1."/>
+      <w:lvlJc w:val="left"/>
+      <w:pPr>
+        <w:ind w:left="720" w:hanging="360"/>
+      </w:pPr>
+      <w:rPr>
+        <w:rFonts w:hint="default"/>
+      </w:rPr>
+    </w:lvl>
+    <w:lvl w:ilvl="1" w:tplc="04090019" w:tentative="1">
+      <w:start w:val="1"/>
+      <w:numFmt w:val="lowerLetter"/>
+      <w:lvlText w:val="%2."/>
+      <w:lvlJc w:val="left"/>
+      <w:pPr>
+        <w:ind w:left="1440" w:hanging="360"/>
+      </w:pPr>
+    </w:lvl>
+    <w:lvl w:ilvl="2" w:tplc="0409001B" w:tentative="1">
+      <w:start w:val="1"/>
+      <w:numFmt w:val="lowerRoman"/>
+      <w:lvlText w:val="%3."/>
+      <w:lvlJc w:val="right"/>
+      <w:pPr>
+        <w:ind w:left="2160" w:hanging="180"/>
+      </w:pPr>
+    </w:lvl>
+    <w:lvl w:ilvl="3" w:tplc="0409000F" w:tentative="1">
+      <w:start w:val="1"/>
+      <w:numFmt w:val="decimal"/>
+      <w:lvlText w:val="%4."/>
+      <w:lvlJc w:val="left"/>
+      <w:pPr>
+        <w:ind w:left="2880" w:hanging="360"/>
+      </w:pPr>
+    </w:lvl>
+    <w:lvl w:ilvl="4" w:tplc="04090019" w:tentative="1">
+      <w:start w:val="1"/>
+      <w:numFmt w:val="lowerLetter"/>
+      <w:lvlText w:val="%5."/>
+      <w:lvlJc w:val="left"/>
+      <w:pPr>
+        <w:ind w:left="3600" w:hanging="360"/>
+      </w:pPr>
+    </w:lvl>
+    <w:lvl w:ilvl="5" w:tplc="0409001B" w:tentative="1">
+      <w:start w:val="1"/>
+      <w:numFmt w:val="lowerRoman"/>
+      <w:lvlText w:val="%6."/>
+      <w:lvlJc w:val="right"/>
+      <w:pPr>
+        <w:ind w:left="4320" w:hanging="180"/>
+      </w:pPr>
+    </w:lvl>
+    <w:lvl w:ilvl="6" w:tplc="0409000F" w:tentative="1">
+      <w:start w:val="1"/>
+      <w:numFmt w:val="decimal"/>
+      <w:lvlText w:val="%7."/>
+      <w:lvlJc w:val="left"/>
+      <w:pPr>
+        <w:ind w:left="5040" w:hanging="360"/>
+      </w:pPr>
+    </w:lvl>
+    <w:lvl w:ilvl="7" w:tplc="04090019" w:tentative="1">
+      <w:start w:val="1"/>
+      <w:numFmt w:val="lowerLetter"/>
+      <w:lvlText w:val="%8."/>
+      <w:lvlJc w:val="left"/>
+      <w:pPr>
+        <w:ind w:left="5760" w:hanging="360"/>
+      </w:pPr>
+    </w:lvl>
+    <w:lvl w:ilvl="8" w:tplc="0409001B" w:tentative="1">
+      <w:start w:val="1"/>
+      <w:numFmt w:val="lowerRoman"/>
+      <w:lvlText w:val="%9."/>
+      <w:lvlJc w:val="right"/>
+      <w:pPr>
+        <w:ind w:left="6480" w:hanging="180"/>
+      </w:pPr>
+    </w:lvl>
+  </w:abstractNum>
+  <w:num w:numId="1" w16cid:durableId="1851601281">
+    <w:abstractNumId w:val="0"/>
+  </w:num>
+</w:numbering>
 </file>
 
 <file path=word/styles.xml><?xml version="1.0" encoding="utf-8"?>
@@ -930,6 +1599,29 @@
       <w:spacing w:val="5"/>
     </w:rPr>
   </w:style>
+  <w:style w:type="character" w:styleId="Hyperlink">
+    <w:name w:val="Hyperlink"/>
+    <w:basedOn w:val="DefaultParagraphFont"/>
+    <w:uiPriority w:val="99"/>
+    <w:unhideWhenUsed/>
+    <w:rsid w:val="00AA0D37"/>
+    <w:rPr>
+      <w:color w:val="467886" w:themeColor="hyperlink"/>
+      <w:u w:val="single"/>
+    </w:rPr>
+  </w:style>
+  <w:style w:type="character" w:styleId="UnresolvedMention">
+    <w:name w:val="Unresolved Mention"/>
+    <w:basedOn w:val="DefaultParagraphFont"/>
+    <w:uiPriority w:val="99"/>
+    <w:semiHidden/>
+    <w:unhideWhenUsed/>
+    <w:rsid w:val="00AA0D37"/>
+    <w:rPr>
+      <w:color w:val="605E5C"/>
+      <w:shd w:val="clear" w:color="auto" w:fill="E1DFDD"/>
+    </w:rPr>
+  </w:style>
 </w:styles>
 </file>
 
@@ -1246,4 +1938,16 @@
     </a:ext>
   </a:extLst>
 </a:theme>
+</file>
+
+<file path=customXml/item1.xml><?xml version="1.0" encoding="utf-8"?>
+<b:Sources xmlns:b="http://schemas.openxmlformats.org/officeDocument/2006/bibliography" xmlns="http://schemas.openxmlformats.org/officeDocument/2006/bibliography" SelectedStyle="\APASixthEditionOfficeOnline.xsl" StyleName="APA" Version="6"/>
+</file>
+
+<file path=customXml/itemProps1.xml><?xml version="1.0" encoding="utf-8"?>
+<ds:datastoreItem xmlns:ds="http://schemas.openxmlformats.org/officeDocument/2006/customXml" ds:itemID="{0D86E8E0-A7BB-4CAF-AD95-010F8A1652A2}">
+  <ds:schemaRefs>
+    <ds:schemaRef ds:uri="http://schemas.openxmlformats.org/officeDocument/2006/bibliography"/>
+  </ds:schemaRefs>
+</ds:datastoreItem>
 </file>
</xml_diff>

<commit_message>
Added quick TradePublisher Demo
</commit_message>
<xml_diff>
--- a/PBT205_A3_Group2_README.docx
+++ b/PBT205_A3_Group2_README.docx
@@ -24,7 +24,10 @@
         <w:spacing w:after="0"/>
       </w:pPr>
       <w:r>
-        <w:t>Date: 6</w:t>
+        <w:t xml:space="preserve">Date: </w:t>
+      </w:r>
+      <w:r>
+        <w:t>7</w:t>
       </w:r>
       <w:r>
         <w:rPr>
@@ -59,6 +62,9 @@
         <w:spacing w:after="0"/>
       </w:pPr>
       <w:r>
+        <w:rPr>
+          <w:noProof/>
+        </w:rPr>
         <w:drawing>
           <wp:inline distT="0" distB="0" distL="0" distR="0" wp14:anchorId="0B99AB90" wp14:editId="4CFC4A46">
             <wp:extent cx="6858000" cy="3866515"/>
@@ -130,6 +136,9 @@
         <w:spacing w:after="0"/>
       </w:pPr>
       <w:r>
+        <w:rPr>
+          <w:noProof/>
+        </w:rPr>
         <w:drawing>
           <wp:inline distT="0" distB="0" distL="0" distR="0" wp14:anchorId="484EEA58" wp14:editId="045C33FF">
             <wp:extent cx="6858000" cy="2482850"/>
@@ -215,6 +224,9 @@
         <w:spacing w:after="0"/>
       </w:pPr>
       <w:r>
+        <w:rPr>
+          <w:noProof/>
+        </w:rPr>
         <w:drawing>
           <wp:inline distT="0" distB="0" distL="0" distR="0" wp14:anchorId="6B1879FA" wp14:editId="611327F1">
             <wp:extent cx="6858000" cy="1524000"/>
@@ -275,6 +287,9 @@
         <w:spacing w:after="0"/>
       </w:pPr>
       <w:r>
+        <w:rPr>
+          <w:noProof/>
+        </w:rPr>
         <w:drawing>
           <wp:inline distT="0" distB="0" distL="0" distR="0" wp14:anchorId="0CA782AC" wp14:editId="44E28F02">
             <wp:extent cx="6858000" cy="3869690"/>
@@ -329,7 +344,7 @@
       <w:r>
         <w:t xml:space="preserve">Go to RabbitMQ, login using “guest” as username and password: </w:t>
       </w:r>
-      <w:hyperlink r:id="rId10" w:history="1">
+      <w:hyperlink r:id="rId10" w:anchor="/queues" w:history="1">
         <w:r>
           <w:rPr>
             <w:rStyle w:val="Hyperlink"/>
@@ -343,6 +358,9 @@
         <w:spacing w:after="0"/>
       </w:pPr>
       <w:r>
+        <w:rPr>
+          <w:noProof/>
+        </w:rPr>
         <w:drawing>
           <wp:inline distT="0" distB="0" distL="0" distR="0" wp14:anchorId="5DF207E1" wp14:editId="4DB33141">
             <wp:extent cx="6858000" cy="1943735"/>
@@ -412,6 +430,9 @@
         <w:spacing w:after="0"/>
       </w:pPr>
       <w:r>
+        <w:rPr>
+          <w:noProof/>
+        </w:rPr>
         <w:drawing>
           <wp:inline distT="0" distB="0" distL="0" distR="0" wp14:anchorId="49302310" wp14:editId="0C86CED3">
             <wp:extent cx="6858000" cy="2311400"/>
@@ -470,14 +491,25 @@
         <w:sym w:font="Wingdings" w:char="F0E0"/>
       </w:r>
       <w:r>
-        <w:t xml:space="preserve"> python gui.py</w:t>
-      </w:r>
-    </w:p>
-    <w:p>
-      <w:pPr>
-        <w:spacing w:after="0"/>
-      </w:pPr>
-      <w:r>
+        <w:t xml:space="preserve"> </w:t>
+      </w:r>
+      <w:proofErr w:type="spellStart"/>
+      <w:r>
+        <w:t>python</w:t>
+      </w:r>
+      <w:proofErr w:type="spellEnd"/>
+      <w:r>
+        <w:t xml:space="preserve"> gui.py</w:t>
+      </w:r>
+    </w:p>
+    <w:p>
+      <w:pPr>
+        <w:spacing w:after="0"/>
+      </w:pPr>
+      <w:r>
+        <w:rPr>
+          <w:noProof/>
+        </w:rPr>
         <w:drawing>
           <wp:inline distT="0" distB="0" distL="0" distR="0" wp14:anchorId="7823FAD7" wp14:editId="0405899C">
             <wp:extent cx="6858000" cy="1456690"/>
@@ -530,14 +562,33 @@
         <w:spacing w:after="0"/>
       </w:pPr>
       <w:r>
-        <w:t>If all of the above worked you should get the GUI which currently looks like this:</w:t>
-      </w:r>
-    </w:p>
-    <w:p>
-      <w:pPr>
-        <w:spacing w:after="0"/>
-      </w:pPr>
-      <w:r>
+        <w:t xml:space="preserve">If </w:t>
+      </w:r>
+      <w:proofErr w:type="gramStart"/>
+      <w:r>
+        <w:t>all of</w:t>
+      </w:r>
+      <w:proofErr w:type="gramEnd"/>
+      <w:r>
+        <w:t xml:space="preserve"> the above </w:t>
+      </w:r>
+      <w:proofErr w:type="gramStart"/>
+      <w:r>
+        <w:t>worked</w:t>
+      </w:r>
+      <w:proofErr w:type="gramEnd"/>
+      <w:r>
+        <w:t xml:space="preserve"> you should get the GUI which currently looks like this:</w:t>
+      </w:r>
+    </w:p>
+    <w:p>
+      <w:pPr>
+        <w:spacing w:after="0"/>
+      </w:pPr>
+      <w:r>
+        <w:rPr>
+          <w:noProof/>
+        </w:rPr>
         <w:drawing>
           <wp:inline distT="0" distB="0" distL="0" distR="0" wp14:anchorId="714C4D33" wp14:editId="0FE58C13">
             <wp:extent cx="6858000" cy="3841750"/>

</xml_diff>

<commit_message>
Final changes for submission
</commit_message>
<xml_diff>
--- a/PBT205_A3_Group2_README.docx
+++ b/PBT205_A3_Group2_README.docx
@@ -224,6 +224,9 @@
         <w:spacing w:after="0"/>
       </w:pPr>
       <w:r>
+        <w:rPr>
+          <w:noProof/>
+        </w:rPr>
         <w:drawing>
           <wp:inline distT="0" distB="0" distL="0" distR="0" wp14:anchorId="7BD62606" wp14:editId="22E355A4">
             <wp:extent cx="6858000" cy="1362075"/>
@@ -443,6 +446,9 @@
         <w:spacing w:after="0"/>
       </w:pPr>
       <w:r>
+        <w:rPr>
+          <w:noProof/>
+        </w:rPr>
         <w:drawing>
           <wp:inline distT="0" distB="0" distL="0" distR="0" wp14:anchorId="7149CB4C" wp14:editId="5BB548AF">
             <wp:extent cx="6858000" cy="2889250"/>
@@ -509,6 +515,9 @@
         <w:spacing w:after="0"/>
       </w:pPr>
       <w:r>
+        <w:rPr>
+          <w:noProof/>
+        </w:rPr>
         <w:drawing>
           <wp:inline distT="0" distB="0" distL="0" distR="0" wp14:anchorId="677034DB" wp14:editId="6C9515B8">
             <wp:extent cx="6858000" cy="1122045"/>
@@ -577,6 +586,9 @@
         <w:spacing w:after="0"/>
       </w:pPr>
       <w:r>
+        <w:rPr>
+          <w:noProof/>
+        </w:rPr>
         <w:drawing>
           <wp:inline distT="0" distB="0" distL="0" distR="0" wp14:anchorId="248449E4" wp14:editId="534A1F81">
             <wp:extent cx="6858000" cy="2689225"/>
@@ -941,6 +953,9 @@
         <w:spacing w:after="0"/>
       </w:pPr>
       <w:r>
+        <w:rPr>
+          <w:noProof/>
+        </w:rPr>
         <w:drawing>
           <wp:inline distT="0" distB="0" distL="0" distR="0" wp14:anchorId="6205B6A3" wp14:editId="70FD1DE1">
             <wp:extent cx="6858000" cy="2423160"/>
@@ -996,6 +1011,9 @@
         <w:spacing w:after="0"/>
       </w:pPr>
       <w:r>
+        <w:rPr>
+          <w:noProof/>
+        </w:rPr>
         <w:drawing>
           <wp:inline distT="0" distB="0" distL="0" distR="0" wp14:anchorId="0EC408E5" wp14:editId="42728BE4">
             <wp:extent cx="6858000" cy="2094865"/>

</xml_diff>